<commit_message>
Clientes empresa: flota, tarifas pactadas y corte mensual (fase 2)
- Cliente de tipo empresa con RUC y datos de facturacion; un gestor de flota.
- TarifaEmpresa: precio pactado por servicio y tipo de vehiculo; la
  cotizacion y la reserva usan la misma regla.
- Estacionamiento privado de una empresa: solo ella reserva, no es publico.
- Lavados de empresa a credito (no se cobran sueltos) y CorteEmpresa
  mensual: cerrar -> facturar -> pagar, anulable; pagar registra un pago por
  lavado para que "cobrado" cuadre. Excel del corte para el sistema contable.
- Pantallas Empresas (panel nacional) y Mi flota (gestor).
- Corregido: el cobrado de un periodo excluia lo cobrado el ultimo dia.
- Migracion 2026-10-12_empresas.sql (solo aditiva), probada sobre copia de
  produccion. 20 pruebas nuevas (251 en total). Manual de administrador 2.2.

Co-Authored-By: Claude Opus 5.5 (1M context) <noreply@anthropic.com>
</commit_message>
<xml_diff>
--- a/docs/08_MANUAL_ADMINISTRADOR/Manual_Administrador.docx
+++ b/docs/08_MANUAL_ADMINISTRADOR/Manual_Administrador.docx
@@ -283,6 +283,41 @@
       <w:r>
         <w:t xml:space="preserve">(sección 9).</w:t>
       </w:r>
+      <w:r>
+        <w:t xml:space="preserve"> </w:t>
+      </w:r>
+      <w:r>
+        <w:rPr>
+          <w:b/>
+          <w:bCs/>
+        </w:rPr>
+        <w:t xml:space="preserve">Clientes empresa</w:t>
+      </w:r>
+      <w:r>
+        <w:t xml:space="preserve"> </w:t>
+      </w:r>
+      <w:r>
+        <w:t xml:space="preserve">(sección 1.3): flota, tarifas pactadas,</w:t>
+      </w:r>
+      <w:r>
+        <w:t xml:space="preserve"> </w:t>
+      </w:r>
+      <w:r>
+        <w:t xml:space="preserve">parqueadero privado y cobro a crédito con</w:t>
+      </w:r>
+      <w:r>
+        <w:t xml:space="preserve"> </w:t>
+      </w:r>
+      <w:r>
+        <w:rPr>
+          <w:b/>
+          <w:bCs/>
+        </w:rPr>
+        <w:t xml:space="preserve">corte mensual</w:t>
+      </w:r>
+      <w:r>
+        <w:t xml:space="preserve">.</w:t>
+      </w:r>
     </w:p>
     <w:p>
       <w:pPr>
@@ -386,7 +421,7 @@
         <w:t xml:space="preserve">.</w:t>
       </w:r>
     </w:p>
-    <w:bookmarkStart w:id="22" w:name="usuarios-y-roles"/>
+    <w:bookmarkStart w:id="23" w:name="usuarios-y-roles"/>
     <w:p>
       <w:pPr>
         <w:pStyle w:val="Heading2"/>
@@ -1754,8 +1789,611 @@
       </w:r>
     </w:p>
     <w:bookmarkEnd w:id="21"/>
+    <w:bookmarkStart w:id="22" w:name="X6f51ac93d55a53da2cc79a47865853d21b69989"/>
+    <w:p>
+      <w:pPr>
+        <w:pStyle w:val="Heading3"/>
+      </w:pPr>
+      <w:r>
+        <w:rPr>
+          <w:rStyle w:val="SectionNumber"/>
+        </w:rPr>
+        <w:t xml:space="preserve">0.1.3</w:t>
+      </w:r>
+      <w:r>
+        <w:tab/>
+      </w:r>
+      <w:r>
+        <w:t xml:space="preserve">1.3 Empresas, tarifas y corte mensual (desde el 2026-10-12)</w:t>
+      </w:r>
+    </w:p>
+    <w:p>
+      <w:pPr>
+        <w:pStyle w:val="FirstParagraph"/>
+      </w:pPr>
+      <w:r>
+        <w:t xml:space="preserve">Una</w:t>
+      </w:r>
+      <w:r>
+        <w:t xml:space="preserve"> </w:t>
+      </w:r>
+      <w:r>
+        <w:rPr>
+          <w:b/>
+          <w:bCs/>
+        </w:rPr>
+        <w:t xml:space="preserve">empresa</w:t>
+      </w:r>
+      <w:r>
+        <w:t xml:space="preserve"> </w:t>
+      </w:r>
+      <w:r>
+        <w:t xml:space="preserve">es un cliente de tipo</w:t>
+      </w:r>
+      <w:r>
+        <w:t xml:space="preserve"> </w:t>
+      </w:r>
+      <w:r>
+        <w:rPr>
+          <w:rStyle w:val="VerbatimChar"/>
+        </w:rPr>
+        <w:t xml:space="preserve">empresa</w:t>
+      </w:r>
+      <w:r>
+        <w:t xml:space="preserve"> </w:t>
+      </w:r>
+      <w:r>
+        <w:t xml:space="preserve">(Clientes →</w:t>
+      </w:r>
+      <w:r>
+        <w:t xml:space="preserve"> </w:t>
+      </w:r>
+      <w:r>
+        <w:t xml:space="preserve">“</w:t>
+      </w:r>
+      <w:r>
+        <w:t xml:space="preserve">Empresa con</w:t>
+      </w:r>
+      <w:r>
+        <w:t xml:space="preserve"> </w:t>
+      </w:r>
+      <w:r>
+        <w:t xml:space="preserve">flota</w:t>
+      </w:r>
+      <w:r>
+        <w:t xml:space="preserve">”</w:t>
+      </w:r>
+      <w:r>
+        <w:t xml:space="preserve">). Necesita</w:t>
+      </w:r>
+      <w:r>
+        <w:t xml:space="preserve"> </w:t>
+      </w:r>
+      <w:r>
+        <w:rPr>
+          <w:b/>
+          <w:bCs/>
+        </w:rPr>
+        <w:t xml:space="preserve">RUC de 13 dígitos</w:t>
+      </w:r>
+      <w:r>
+        <w:t xml:space="preserve"> </w:t>
+      </w:r>
+      <w:r>
+        <w:t xml:space="preserve">(es a quien se le factura); conviene</w:t>
+      </w:r>
+      <w:r>
+        <w:t xml:space="preserve"> </w:t>
+      </w:r>
+      <w:r>
+        <w:t xml:space="preserve">cargar razón social, email de facturación y dirección fiscal, que salen en el</w:t>
+      </w:r>
+      <w:r>
+        <w:t xml:space="preserve"> </w:t>
+      </w:r>
+      <w:r>
+        <w:t xml:space="preserve">Excel del corte. Sus vehículos son su flota y tiene</w:t>
+      </w:r>
+      <w:r>
+        <w:t xml:space="preserve"> </w:t>
+      </w:r>
+      <w:r>
+        <w:rPr>
+          <w:b/>
+          <w:bCs/>
+        </w:rPr>
+        <w:t xml:space="preserve">un solo usuario</w:t>
+      </w:r>
+      <w:r>
+        <w:t xml:space="preserve">: el</w:t>
+      </w:r>
+      <w:r>
+        <w:t xml:space="preserve"> </w:t>
+      </w:r>
+      <w:r>
+        <w:t xml:space="preserve">gestor de flota (el email de la ficha, con</w:t>
+      </w:r>
+      <w:r>
+        <w:t xml:space="preserve"> </w:t>
+      </w:r>
+      <w:r>
+        <w:t xml:space="preserve">“</w:t>
+      </w:r>
+      <w:r>
+        <w:t xml:space="preserve">Crear su acceso</w:t>
+      </w:r>
+      <w:r>
+        <w:t xml:space="preserve">”</w:t>
+      </w:r>
+      <w:r>
+        <w:t xml:space="preserve">).</w:t>
+      </w:r>
+    </w:p>
+    <w:tbl>
+      <w:tblPr>
+        <w:tblStyle w:val="Table"/>
+        <w:tblW w:type="pct" w:w="5000"/>
+        <w:jc w:val="left"/>
+        <w:tblLayout w:type="fixed"/>
+        <w:tblLook w:firstRow="1" w:lastRow="0" w:firstColumn="0" w:lastColumn="0" w:noHBand="0" w:noVBand="0" w:val="0020"/>
+      </w:tblPr>
+      <w:tblGrid>
+        <w:gridCol w:w="3960"/>
+        <w:gridCol w:w="3960"/>
+      </w:tblGrid>
+      <w:tr>
+        <w:trPr>
+          <w:tblHeader w:val="on"/>
+        </w:trPr>
+        <w:tc>
+          <w:tcPr/>
+          <w:p>
+            <w:pPr>
+              <w:pStyle w:val="Compact"/>
+              <w:jc w:val="left"/>
+            </w:pPr>
+            <w:r>
+              <w:t xml:space="preserve">Qué</w:t>
+            </w:r>
+          </w:p>
+        </w:tc>
+        <w:tc>
+          <w:tcPr/>
+          <w:p>
+            <w:pPr>
+              <w:pStyle w:val="Compact"/>
+              <w:jc w:val="left"/>
+            </w:pPr>
+            <w:r>
+              <w:t xml:space="preserve">Cómo funciona</w:t>
+            </w:r>
+          </w:p>
+        </w:tc>
+      </w:tr>
+      <w:tr>
+        <w:tc>
+          <w:tcPr/>
+          <w:p>
+            <w:pPr>
+              <w:pStyle w:val="Compact"/>
+              <w:jc w:val="left"/>
+            </w:pPr>
+            <w:r>
+              <w:rPr>
+                <w:b/>
+                <w:bCs/>
+              </w:rPr>
+              <w:t xml:space="preserve">Tarifa pactada</w:t>
+            </w:r>
+          </w:p>
+        </w:tc>
+        <w:tc>
+          <w:tcPr/>
+          <w:p>
+            <w:pPr>
+              <w:pStyle w:val="Compact"/>
+              <w:jc w:val="left"/>
+            </w:pPr>
+            <w:r>
+              <w:t xml:space="preserve">Empresas → la empresa → Tarifas pactadas. Precio por servicio y tipo de vehículo; vacío = paga el de lista. Rige para las reservas nuevas. Los adicionales van a precio de lista</w:t>
+            </w:r>
+          </w:p>
+        </w:tc>
+      </w:tr>
+      <w:tr>
+        <w:tc>
+          <w:tcPr/>
+          <w:p>
+            <w:pPr>
+              <w:pStyle w:val="Compact"/>
+              <w:jc w:val="left"/>
+            </w:pPr>
+            <w:r>
+              <w:rPr>
+                <w:b/>
+                <w:bCs/>
+              </w:rPr>
+              <w:t xml:space="preserve">Parqueadero privado</w:t>
+            </w:r>
+          </w:p>
+        </w:tc>
+        <w:tc>
+          <w:tcPr/>
+          <w:p>
+            <w:pPr>
+              <w:pStyle w:val="Compact"/>
+              <w:jc w:val="left"/>
+            </w:pPr>
+            <w:r>
+              <w:t xml:space="preserve">Estacionamientos → tipo</w:t>
+            </w:r>
+            <w:r>
+              <w:t xml:space="preserve"> </w:t>
+            </w:r>
+            <w:r>
+              <w:rPr>
+                <w:b/>
+                <w:bCs/>
+              </w:rPr>
+              <w:t xml:space="preserve">Privado</w:t>
+            </w:r>
+            <w:r>
+              <w:t xml:space="preserve"> </w:t>
+            </w:r>
+            <w:r>
+              <w:t xml:space="preserve">+ la empresa dueña. Solo esa empresa lo ve y reserva ahí; no aparece al público</w:t>
+            </w:r>
+          </w:p>
+        </w:tc>
+      </w:tr>
+      <w:tr>
+        <w:tc>
+          <w:tcPr/>
+          <w:p>
+            <w:pPr>
+              <w:pStyle w:val="Compact"/>
+              <w:jc w:val="left"/>
+            </w:pPr>
+            <w:r>
+              <w:rPr>
+                <w:b/>
+                <w:bCs/>
+              </w:rPr>
+              <w:t xml:space="preserve">Cobro</w:t>
+            </w:r>
+          </w:p>
+        </w:tc>
+        <w:tc>
+          <w:tcPr/>
+          <w:p>
+            <w:pPr>
+              <w:pStyle w:val="Compact"/>
+              <w:jc w:val="left"/>
+            </w:pPr>
+            <w:r>
+              <w:t xml:space="preserve">Sus lavados nacen</w:t>
+            </w:r>
+            <w:r>
+              <w:t xml:space="preserve"> </w:t>
+            </w:r>
+            <w:r>
+              <w:rPr>
+                <w:b/>
+                <w:bCs/>
+              </w:rPr>
+              <w:t xml:space="preserve">a crédito</w:t>
+            </w:r>
+            <w:r>
+              <w:t xml:space="preserve">: no se pagan sueltos (ni el panel ni la app lo permiten). Se cobran en el corte mensual</w:t>
+            </w:r>
+          </w:p>
+        </w:tc>
+      </w:tr>
+      <w:tr>
+        <w:tc>
+          <w:tcPr/>
+          <w:p>
+            <w:pPr>
+              <w:pStyle w:val="Compact"/>
+              <w:jc w:val="left"/>
+            </w:pPr>
+            <w:r>
+              <w:rPr>
+                <w:b/>
+                <w:bCs/>
+              </w:rPr>
+              <w:t xml:space="preserve">Mi flota</w:t>
+            </w:r>
+          </w:p>
+        </w:tc>
+        <w:tc>
+          <w:tcPr/>
+          <w:p>
+            <w:pPr>
+              <w:pStyle w:val="Compact"/>
+              <w:jc w:val="left"/>
+            </w:pPr>
+            <w:r>
+              <w:t xml:space="preserve">El gestor ve el gasto del mes por vehículo, lo pendiente de facturar y sus cortes con el Excel</w:t>
+            </w:r>
+          </w:p>
+        </w:tc>
+      </w:tr>
+    </w:tbl>
+    <w:p>
+      <w:pPr>
+        <w:pStyle w:val="BodyText"/>
+      </w:pPr>
+      <w:r>
+        <w:rPr>
+          <w:b/>
+          <w:bCs/>
+        </w:rPr>
+        <w:t xml:space="preserve">Ciclo del corte</w:t>
+      </w:r>
+      <w:r>
+        <w:t xml:space="preserve"> </w:t>
+      </w:r>
+      <w:r>
+        <w:t xml:space="preserve">(Empresas → la empresa → Cortar un mes):</w:t>
+      </w:r>
+    </w:p>
+    <w:p>
+      <w:pPr>
+        <w:pStyle w:val="Compact"/>
+        <w:numPr>
+          <w:ilvl w:val="0"/>
+          <w:numId w:val="1002"/>
+        </w:numPr>
+      </w:pPr>
+      <w:r>
+        <w:rPr>
+          <w:b/>
+          <w:bCs/>
+        </w:rPr>
+        <w:t xml:space="preserve">Cerrar.</w:t>
+      </w:r>
+      <w:r>
+        <w:t xml:space="preserve"> </w:t>
+      </w:r>
+      <w:r>
+        <w:t xml:space="preserve">Se elige el mes (por defecto, el anterior) y se revisa la vista</w:t>
+      </w:r>
+      <w:r>
+        <w:t xml:space="preserve"> </w:t>
+      </w:r>
+      <w:r>
+        <w:t xml:space="preserve">previa. Entran los lavados</w:t>
+      </w:r>
+      <w:r>
+        <w:t xml:space="preserve"> </w:t>
+      </w:r>
+      <w:r>
+        <w:rPr>
+          <w:b/>
+          <w:bCs/>
+        </w:rPr>
+        <w:t xml:space="preserve">completados</w:t>
+      </w:r>
+      <w:r>
+        <w:t xml:space="preserve"> </w:t>
+      </w:r>
+      <w:r>
+        <w:t xml:space="preserve">a crédito hasta fin de ese mes que</w:t>
+      </w:r>
+      <w:r>
+        <w:t xml:space="preserve"> </w:t>
+      </w:r>
+      <w:r>
+        <w:t xml:space="preserve">no estén en otro corte, incluidos los de meses anteriores que quedaron</w:t>
+      </w:r>
+      <w:r>
+        <w:t xml:space="preserve"> </w:t>
+      </w:r>
+      <w:r>
+        <w:t xml:space="preserve">afuera. Los que todavía no se completan entran en el corte siguiente. Los</w:t>
+      </w:r>
+      <w:r>
+        <w:t xml:space="preserve"> </w:t>
+      </w:r>
+      <w:r>
+        <w:t xml:space="preserve">cancelados y</w:t>
+      </w:r>
+      <w:r>
+        <w:t xml:space="preserve"> </w:t>
+      </w:r>
+      <w:r>
+        <w:t xml:space="preserve">“</w:t>
+      </w:r>
+      <w:r>
+        <w:t xml:space="preserve">no asistió</w:t>
+      </w:r>
+      <w:r>
+        <w:t xml:space="preserve">”</w:t>
+      </w:r>
+      <w:r>
+        <w:t xml:space="preserve"> </w:t>
+      </w:r>
+      <w:r>
+        <w:t xml:space="preserve">no se cobran. Hay un corte por empresa y mes.</w:t>
+      </w:r>
+    </w:p>
+    <w:p>
+      <w:pPr>
+        <w:pStyle w:val="Compact"/>
+        <w:numPr>
+          <w:ilvl w:val="0"/>
+          <w:numId w:val="1002"/>
+        </w:numPr>
+      </w:pPr>
+      <w:r>
+        <w:rPr>
+          <w:b/>
+          <w:bCs/>
+        </w:rPr>
+        <w:t xml:space="preserve">Facturar.</w:t>
+      </w:r>
+      <w:r>
+        <w:t xml:space="preserve"> </w:t>
+      </w:r>
+      <w:r>
+        <w:t xml:space="preserve">Con el Excel del corte se emite la factura electrónica en el</w:t>
+      </w:r>
+      <w:r>
+        <w:t xml:space="preserve"> </w:t>
+      </w:r>
+      <w:r>
+        <w:rPr>
+          <w:b/>
+          <w:bCs/>
+        </w:rPr>
+        <w:t xml:space="preserve">sistema contable</w:t>
+      </w:r>
+      <w:r>
+        <w:t xml:space="preserve"> </w:t>
+      </w:r>
+      <w:r>
+        <w:t xml:space="preserve">(este sistema no emite facturas) y se registra aquí el</w:t>
+      </w:r>
+      <w:r>
+        <w:t xml:space="preserve"> </w:t>
+      </w:r>
+      <w:r>
+        <w:t xml:space="preserve">número que dio.</w:t>
+      </w:r>
+    </w:p>
+    <w:p>
+      <w:pPr>
+        <w:pStyle w:val="Compact"/>
+        <w:numPr>
+          <w:ilvl w:val="0"/>
+          <w:numId w:val="1002"/>
+        </w:numPr>
+      </w:pPr>
+      <w:r>
+        <w:rPr>
+          <w:b/>
+          <w:bCs/>
+        </w:rPr>
+        <w:t xml:space="preserve">Pagar.</w:t>
+      </w:r>
+      <w:r>
+        <w:t xml:space="preserve"> </w:t>
+      </w:r>
+      <w:r>
+        <w:t xml:space="preserve">Al recibir el pago se registra con su referencia. El sistema crea</w:t>
+      </w:r>
+      <w:r>
+        <w:t xml:space="preserve"> </w:t>
+      </w:r>
+      <w:r>
+        <w:t xml:space="preserve">un pago aprobado por cada lavado del corte, así el</w:t>
+      </w:r>
+      <w:r>
+        <w:t xml:space="preserve"> </w:t>
+      </w:r>
+      <w:r>
+        <w:t xml:space="preserve">“</w:t>
+      </w:r>
+      <w:r>
+        <w:t xml:space="preserve">cobrado</w:t>
+      </w:r>
+      <w:r>
+        <w:t xml:space="preserve">”</w:t>
+      </w:r>
+      <w:r>
+        <w:t xml:space="preserve"> </w:t>
+      </w:r>
+      <w:r>
+        <w:t xml:space="preserve">de Reportes y el</w:t>
+      </w:r>
+      <w:r>
+        <w:t xml:space="preserve"> </w:t>
+      </w:r>
+      <w:r>
+        <w:t xml:space="preserve">saldo de cada reserva cuadran igual que con los clientes de contado.</w:t>
+      </w:r>
+    </w:p>
+    <w:p>
+      <w:pPr>
+        <w:pStyle w:val="FirstParagraph"/>
+      </w:pPr>
+      <w:r>
+        <w:t xml:space="preserve">Un corte</w:t>
+      </w:r>
+      <w:r>
+        <w:t xml:space="preserve"> </w:t>
+      </w:r>
+      <w:r>
+        <w:rPr>
+          <w:b/>
+          <w:bCs/>
+        </w:rPr>
+        <w:t xml:space="preserve">cerrado o facturado se puede anular</w:t>
+      </w:r>
+      <w:r>
+        <w:t xml:space="preserve"> </w:t>
+      </w:r>
+      <w:r>
+        <w:t xml:space="preserve">(con motivo): sus lavados</w:t>
+      </w:r>
+      <w:r>
+        <w:t xml:space="preserve"> </w:t>
+      </w:r>
+      <w:r>
+        <w:t xml:space="preserve">vuelven a quedar pendientes y entran en el próximo corte, que lleva sufijo</w:t>
+      </w:r>
+      <w:r>
+        <w:t xml:space="preserve"> </w:t>
+      </w:r>
+      <w:r>
+        <w:t xml:space="preserve">(</w:t>
+      </w:r>
+      <w:r>
+        <w:rPr>
+          <w:rStyle w:val="VerbatimChar"/>
+        </w:rPr>
+        <w:t xml:space="preserve">CORTE-2026-10-E0011-2</w:t>
+      </w:r>
+      <w:r>
+        <w:t xml:space="preserve">). Uno</w:t>
+      </w:r>
+      <w:r>
+        <w:t xml:space="preserve"> </w:t>
+      </w:r>
+      <w:r>
+        <w:rPr>
+          <w:b/>
+          <w:bCs/>
+        </w:rPr>
+        <w:t xml:space="preserve">pagado no se anula</w:t>
+      </w:r>
+      <w:r>
+        <w:t xml:space="preserve">. La pantalla Empresas</w:t>
+      </w:r>
+      <w:r>
+        <w:t xml:space="preserve"> </w:t>
+      </w:r>
+      <w:r>
+        <w:t xml:space="preserve">(y los cortes) es de</w:t>
+      </w:r>
+      <w:r>
+        <w:t xml:space="preserve"> </w:t>
+      </w:r>
+      <w:r>
+        <w:rPr>
+          <w:b/>
+          <w:bCs/>
+        </w:rPr>
+        <w:t xml:space="preserve">alcance nacional</w:t>
+      </w:r>
+      <w:r>
+        <w:t xml:space="preserve">: admin u operador sin ciudad.</w:t>
+      </w:r>
+    </w:p>
     <w:bookmarkEnd w:id="22"/>
-    <w:bookmarkStart w:id="24" w:name="catálogos"/>
+    <w:bookmarkEnd w:id="23"/>
+    <w:bookmarkStart w:id="25" w:name="catálogos"/>
     <w:p>
       <w:pPr>
         <w:pStyle w:val="Heading2"/>
@@ -2180,7 +2818,7 @@
         <w:t xml:space="preserve">.</w:t>
       </w:r>
     </w:p>
-    <w:bookmarkStart w:id="23" w:name="vehículos-de-cada-cliente"/>
+    <w:bookmarkStart w:id="24" w:name="vehículos-de-cada-cliente"/>
     <w:p>
       <w:pPr>
         <w:pStyle w:val="Heading3"/>
@@ -2543,9 +3181,9 @@
         <w:t xml:space="preserve">abrir la fila no consulta nada: es instantáneo.</w:t>
       </w:r>
     </w:p>
-    <w:bookmarkEnd w:id="23"/>
     <w:bookmarkEnd w:id="24"/>
-    <w:bookmarkStart w:id="25" w:name="precios-por-tipo-de-vehículo"/>
+    <w:bookmarkEnd w:id="25"/>
+    <w:bookmarkStart w:id="26" w:name="precios-por-tipo-de-vehículo"/>
     <w:p>
       <w:pPr>
         <w:pStyle w:val="Heading2"/>
@@ -2642,491 +3280,6 @@
       </w:r>
       <w:r>
         <w:t xml:space="preserve">).</w:t>
-      </w:r>
-    </w:p>
-    <w:p>
-      <w:pPr>
-        <w:pStyle w:val="Compact"/>
-        <w:numPr>
-          <w:ilvl w:val="0"/>
-          <w:numId w:val="1002"/>
-        </w:numPr>
-      </w:pPr>
-      <w:r>
-        <w:t xml:space="preserve">Un servicio se ofrece a un tipo solo si existe esa fila, con</w:t>
-      </w:r>
-      <w:r>
-        <w:t xml:space="preserve"> </w:t>
-      </w:r>
-      <w:r>
-        <w:rPr>
-          <w:rStyle w:val="VerbatimChar"/>
-        </w:rPr>
-        <w:t xml:space="preserve">activo = true</w:t>
-      </w:r>
-      <w:r>
-        <w:t xml:space="preserve">, y el tipo está activo.</w:t>
-      </w:r>
-    </w:p>
-    <w:p>
-      <w:pPr>
-        <w:pStyle w:val="Compact"/>
-        <w:numPr>
-          <w:ilvl w:val="0"/>
-          <w:numId w:val="1002"/>
-        </w:numPr>
-      </w:pPr>
-      <w:r>
-        <w:t xml:space="preserve">La duración de la fila define cuánto se bloquea en la agenda.</w:t>
-      </w:r>
-    </w:p>
-    <w:p>
-      <w:pPr>
-        <w:pStyle w:val="Compact"/>
-        <w:numPr>
-          <w:ilvl w:val="0"/>
-          <w:numId w:val="1002"/>
-        </w:numPr>
-      </w:pPr>
-      <w:r>
-        <w:rPr>
-          <w:rStyle w:val="VerbatimChar"/>
-        </w:rPr>
-        <w:t xml:space="preserve">GET /api/public/servicios</w:t>
-      </w:r>
-      <w:r>
-        <w:t xml:space="preserve"> </w:t>
-      </w:r>
-      <w:r>
-        <w:t xml:space="preserve">devuelve cada servicio con sus precios y</w:t>
-      </w:r>
-      <w:r>
-        <w:t xml:space="preserve"> </w:t>
-      </w:r>
-      <w:r>
-        <w:rPr>
-          <w:rStyle w:val="VerbatimChar"/>
-        </w:rPr>
-        <w:t xml:space="preserve">precio_desde</w:t>
-      </w:r>
-      <w:r>
-        <w:t xml:space="preserve">; omite los que no tienen ningún precio.</w:t>
-      </w:r>
-    </w:p>
-    <w:p>
-      <w:pPr>
-        <w:pStyle w:val="Compact"/>
-        <w:numPr>
-          <w:ilvl w:val="0"/>
-          <w:numId w:val="1002"/>
-        </w:numPr>
-      </w:pPr>
-      <w:r>
-        <w:rPr>
-          <w:rStyle w:val="VerbatimChar"/>
-        </w:rPr>
-        <w:t xml:space="preserve">POST</w:t>
-      </w:r>
-      <w:r>
-        <w:t xml:space="preserve"> </w:t>
-      </w:r>
-      <w:r>
-        <w:t xml:space="preserve">y</w:t>
-      </w:r>
-      <w:r>
-        <w:t xml:space="preserve"> </w:t>
-      </w:r>
-      <w:r>
-        <w:rPr>
-          <w:rStyle w:val="VerbatimChar"/>
-        </w:rPr>
-        <w:t xml:space="preserve">PUT /api/servicios</w:t>
-      </w:r>
-      <w:r>
-        <w:t xml:space="preserve"> </w:t>
-      </w:r>
-      <w:r>
-        <w:t xml:space="preserve">reciben</w:t>
-      </w:r>
-      <w:r>
-        <w:t xml:space="preserve"> </w:t>
-      </w:r>
-      <w:r>
-        <w:rPr>
-          <w:rStyle w:val="VerbatimChar"/>
-        </w:rPr>
-        <w:t xml:space="preserve">precios: [{ id_tipo_vehiculo, precio, duracion_min }]</w:t>
-      </w:r>
-      <w:r>
-        <w:t xml:space="preserve">. Un tipo que deja de venir queda desactivado, no borrado. No se acepta un servicio sin ningún precio.</w:t>
-      </w:r>
-    </w:p>
-    <w:p>
-      <w:pPr>
-        <w:pStyle w:val="Compact"/>
-        <w:numPr>
-          <w:ilvl w:val="0"/>
-          <w:numId w:val="1002"/>
-        </w:numPr>
-      </w:pPr>
-      <w:r>
-        <w:t xml:space="preserve">Tipos de vehículo:</w:t>
-      </w:r>
-      <w:r>
-        <w:t xml:space="preserve"> </w:t>
-      </w:r>
-      <w:r>
-        <w:rPr>
-          <w:rStyle w:val="VerbatimChar"/>
-        </w:rPr>
-        <w:t xml:space="preserve">GET/POST/PUT /api/tipos-vehiculo</w:t>
-      </w:r>
-      <w:r>
-        <w:t xml:space="preserve"> </w:t>
-      </w:r>
-      <w:r>
-        <w:t xml:space="preserve">(interno) y</w:t>
-      </w:r>
-      <w:r>
-        <w:t xml:space="preserve"> </w:t>
-      </w:r>
-      <w:r>
-        <w:rPr>
-          <w:rStyle w:val="VerbatimChar"/>
-        </w:rPr>
-        <w:t xml:space="preserve">GET /api/public/tipos-vehiculo</w:t>
-      </w:r>
-      <w:r>
-        <w:t xml:space="preserve">. El</w:t>
-      </w:r>
-      <w:r>
-        <w:t xml:space="preserve"> </w:t>
-      </w:r>
-      <w:r>
-        <w:rPr>
-          <w:rStyle w:val="VerbatimChar"/>
-        </w:rPr>
-        <w:t xml:space="preserve">codigo</w:t>
-      </w:r>
-      <w:r>
-        <w:t xml:space="preserve"> </w:t>
-      </w:r>
-      <w:r>
-        <w:t xml:space="preserve">se genera a partir del nombre.</w:t>
-      </w:r>
-    </w:p>
-    <w:p>
-      <w:pPr>
-        <w:pStyle w:val="FirstParagraph"/>
-      </w:pPr>
-      <w:r>
-        <w:rPr>
-          <w:rStyle w:val="VerbatimChar"/>
-        </w:rPr>
-        <w:t xml:space="preserve">Vehiculo.id_tipo_vehiculo</w:t>
-      </w:r>
-      <w:r>
-        <w:t xml:space="preserve"> </w:t>
-      </w:r>
-      <w:r>
-        <w:t xml:space="preserve">es obligatorio al registrar (</w:t>
-      </w:r>
-      <w:r>
-        <w:rPr>
-          <w:rStyle w:val="VerbatimChar"/>
-        </w:rPr>
-        <w:t xml:space="preserve">POST /api/vehiculos</w:t>
-      </w:r>
-      <w:r>
-        <w:t xml:space="preserve">).</w:t>
-      </w:r>
-      <w:r>
-        <w:t xml:space="preserve"> </w:t>
-      </w:r>
-      <w:r>
-        <w:t xml:space="preserve">Admite</w:t>
-      </w:r>
-      <w:r>
-        <w:t xml:space="preserve"> </w:t>
-      </w:r>
-      <w:r>
-        <w:rPr>
-          <w:rStyle w:val="VerbatimChar"/>
-        </w:rPr>
-        <w:t xml:space="preserve">null</w:t>
-      </w:r>
-      <w:r>
-        <w:t xml:space="preserve"> </w:t>
-      </w:r>
-      <w:r>
-        <w:t xml:space="preserve">solo por los vehículos anteriores al catálogo:</w:t>
-      </w:r>
-      <w:r>
-        <w:t xml:space="preserve"> </w:t>
-      </w:r>
-      <w:r>
-        <w:rPr>
-          <w:b/>
-          <w:bCs/>
-        </w:rPr>
-        <w:t xml:space="preserve">3 vehículos</w:t>
-      </w:r>
-      <w:r>
-        <w:t xml:space="preserve"> </w:t>
-      </w:r>
-      <w:r>
-        <w:t xml:space="preserve">siguen</w:t>
-      </w:r>
-      <w:r>
-        <w:t xml:space="preserve"> </w:t>
-      </w:r>
-      <w:r>
-        <w:t xml:space="preserve">sin tipo y no pueden reservar hasta que su dueño o el operador lo complete. El</w:t>
-      </w:r>
-      <w:r>
-        <w:t xml:space="preserve"> </w:t>
-      </w:r>
-      <w:r>
-        <w:t xml:space="preserve">cliente puede editar sus propios vehículos (</w:t>
-      </w:r>
-      <w:r>
-        <w:rPr>
-          <w:rStyle w:val="VerbatimChar"/>
-        </w:rPr>
-        <w:t xml:space="preserve">PUT /api/vehiculos/:id</w:t>
-      </w:r>
-      <w:r>
-        <w:t xml:space="preserve">), pero no su estado.</w:t>
-      </w:r>
-    </w:p>
-    <w:p>
-      <w:pPr>
-        <w:pStyle w:val="BlockText"/>
-      </w:pPr>
-      <w:r>
-        <w:rPr>
-          <w:b/>
-          <w:bCs/>
-        </w:rPr>
-        <w:t xml:space="preserve">Pendiente (2026-09-27):</w:t>
-      </w:r>
-      <w:r>
-        <w:t xml:space="preserve"> </w:t>
-      </w:r>
-      <w:r>
-        <w:t xml:space="preserve">el tipo</w:t>
-      </w:r>
-      <w:r>
-        <w:t xml:space="preserve"> </w:t>
-      </w:r>
-      <w:r>
-        <w:rPr>
-          <w:b/>
-          <w:bCs/>
-        </w:rPr>
-        <w:t xml:space="preserve">moto</w:t>
-      </w:r>
-      <w:r>
-        <w:t xml:space="preserve"> </w:t>
-      </w:r>
-      <w:r>
-        <w:t xml:space="preserve">no tiene ningún precio, así que</w:t>
-      </w:r>
-      <w:r>
-        <w:t xml:space="preserve"> </w:t>
-      </w:r>
-      <w:r>
-        <w:t xml:space="preserve">ningún servicio se le ofrece. La migración no inventó tarifas: se cargan desde</w:t>
-      </w:r>
-      <w:r>
-        <w:t xml:space="preserve"> </w:t>
-      </w:r>
-      <w:r>
-        <w:rPr>
-          <w:b/>
-          <w:bCs/>
-        </w:rPr>
-        <w:t xml:space="preserve">Servicios → Servicios y precios</w:t>
-      </w:r>
-      <w:r>
-        <w:t xml:space="preserve">.</w:t>
-      </w:r>
-    </w:p>
-    <w:bookmarkEnd w:id="25"/>
-    <w:bookmarkStart w:id="26" w:name="servicios-adicionales"/>
-    <w:p>
-      <w:pPr>
-        <w:pStyle w:val="Heading2"/>
-      </w:pPr>
-      <w:r>
-        <w:rPr>
-          <w:rStyle w:val="SectionNumber"/>
-        </w:rPr>
-        <w:t xml:space="preserve">0.4</w:t>
-      </w:r>
-      <w:r>
-        <w:tab/>
-      </w:r>
-      <w:r>
-        <w:t xml:space="preserve">4. Servicios adicionales</w:t>
-      </w:r>
-    </w:p>
-    <w:p>
-      <w:pPr>
-        <w:pStyle w:val="FirstParagraph"/>
-      </w:pPr>
-      <w:r>
-        <w:rPr>
-          <w:rStyle w:val="VerbatimChar"/>
-        </w:rPr>
-        <w:t xml:space="preserve">ServicioAdicional</w:t>
-      </w:r>
-      <w:r>
-        <w:t xml:space="preserve"> </w:t>
-      </w:r>
-      <w:r>
-        <w:t xml:space="preserve">(nombre, precio,</w:t>
-      </w:r>
-      <w:r>
-        <w:t xml:space="preserve"> </w:t>
-      </w:r>
-      <w:r>
-        <w:rPr>
-          <w:rStyle w:val="VerbatimChar"/>
-        </w:rPr>
-        <w:t xml:space="preserve">duracion_min</w:t>
-      </w:r>
-      <w:r>
-        <w:t xml:space="preserve"> </w:t>
-      </w:r>
-      <w:r>
-        <w:t xml:space="preserve">extra). CRUD interno en</w:t>
-      </w:r>
-      <w:r>
-        <w:t xml:space="preserve"> </w:t>
-      </w:r>
-      <w:r>
-        <w:rPr>
-          <w:rStyle w:val="VerbatimChar"/>
-        </w:rPr>
-        <w:t xml:space="preserve">/api/adicionales</w:t>
-      </w:r>
-      <w:r>
-        <w:t xml:space="preserve">; lectura pública en</w:t>
-      </w:r>
-      <w:r>
-        <w:t xml:space="preserve"> </w:t>
-      </w:r>
-      <w:r>
-        <w:rPr>
-          <w:rStyle w:val="VerbatimChar"/>
-        </w:rPr>
-        <w:t xml:space="preserve">/api/public/adicionales</w:t>
-      </w:r>
-      <w:r>
-        <w:t xml:space="preserve">.</w:t>
-      </w:r>
-    </w:p>
-    <w:p>
-      <w:pPr>
-        <w:pStyle w:val="BodyText"/>
-      </w:pPr>
-      <w:r>
-        <w:t xml:space="preserve">Al reservar, cada adicional elegido se copia a</w:t>
-      </w:r>
-      <w:r>
-        <w:t xml:space="preserve"> </w:t>
-      </w:r>
-      <w:r>
-        <w:rPr>
-          <w:rStyle w:val="VerbatimChar"/>
-        </w:rPr>
-        <w:t xml:space="preserve">ReservaAdicional</w:t>
-      </w:r>
-      <w:r>
-        <w:t xml:space="preserve"> </w:t>
-      </w:r>
-      <w:r>
-        <w:t xml:space="preserve">(nombre, precio</w:t>
-      </w:r>
-      <w:r>
-        <w:t xml:space="preserve"> </w:t>
-      </w:r>
-      <w:r>
-        <w:t xml:space="preserve">y minutos): cambiar el catálogo después no altera reservas ya hechas.</w:t>
-      </w:r>
-      <w:r>
-        <w:t xml:space="preserve"> </w:t>
-      </w:r>
-      <w:r>
-        <w:rPr>
-          <w:rStyle w:val="VerbatimChar"/>
-        </w:rPr>
-        <w:t xml:space="preserve">Reserva.precio_final</w:t>
-      </w:r>
-      <w:r>
-        <w:t xml:space="preserve"> </w:t>
-      </w:r>
-      <w:r>
-        <w:t xml:space="preserve">= precio del servicio para el tipo de vehículo (0 si lo cubre</w:t>
-      </w:r>
-      <w:r>
-        <w:t xml:space="preserve"> </w:t>
-      </w:r>
-      <w:r>
-        <w:t xml:space="preserve">un plan) + adicionales.</w:t>
-      </w:r>
-      <w:r>
-        <w:t xml:space="preserve"> </w:t>
-      </w:r>
-      <w:r>
-        <w:rPr>
-          <w:b/>
-          <w:bCs/>
-        </w:rPr>
-        <w:t xml:space="preserve">Los planes no cubren adicionales.</w:t>
-      </w:r>
-    </w:p>
-    <w:bookmarkEnd w:id="26"/>
-    <w:bookmarkStart w:id="27" w:name="cotización-y-creación-de-reservas"/>
-    <w:p>
-      <w:pPr>
-        <w:pStyle w:val="Heading2"/>
-      </w:pPr>
-      <w:r>
-        <w:rPr>
-          <w:rStyle w:val="SectionNumber"/>
-        </w:rPr>
-        <w:t xml:space="preserve">0.5</w:t>
-      </w:r>
-      <w:r>
-        <w:tab/>
-      </w:r>
-      <w:r>
-        <w:t xml:space="preserve">5. Cotización y creación de reservas</w:t>
-      </w:r>
-    </w:p>
-    <w:p>
-      <w:pPr>
-        <w:pStyle w:val="FirstParagraph"/>
-      </w:pPr>
-      <w:r>
-        <w:t xml:space="preserve">El precio y la duración los calcula siempre el backend (</w:t>
-      </w:r>
-      <w:r>
-        <w:rPr>
-          <w:rStyle w:val="VerbatimChar"/>
-        </w:rPr>
-        <w:t xml:space="preserve">services/cotizacion.service.js</w:t>
-      </w:r>
-      <w:r>
-        <w:t xml:space="preserve">);</w:t>
-      </w:r>
-      <w:r>
-        <w:t xml:space="preserve"> </w:t>
-      </w:r>
-      <w:r>
-        <w:t xml:space="preserve">lo que muestra la pantalla sale de la misma cuenta.</w:t>
       </w:r>
     </w:p>
     <w:p>
@@ -3138,28 +3291,19 @@
         </w:numPr>
       </w:pPr>
       <w:r>
-        <w:rPr>
-          <w:rStyle w:val="VerbatimChar"/>
-        </w:rPr>
-        <w:t xml:space="preserve">POST /api/reservas/cotizar</w:t>
-      </w:r>
-      <w:r>
-        <w:t xml:space="preserve"> </w:t>
-      </w:r>
-      <w:r>
-        <w:t xml:space="preserve">— vista previa:</w:t>
-      </w:r>
-      <w:r>
-        <w:t xml:space="preserve"> </w:t>
-      </w:r>
-      <w:r>
-        <w:rPr>
-          <w:rStyle w:val="VerbatimChar"/>
-        </w:rPr>
-        <w:t xml:space="preserve">{ id_vehiculo, id_tipo_servicio, adicionales }</w:t>
-      </w:r>
-      <w:r>
-        <w:t xml:space="preserve">.</w:t>
+        <w:t xml:space="preserve">Un servicio se ofrece a un tipo solo si existe esa fila, con</w:t>
+      </w:r>
+      <w:r>
+        <w:t xml:space="preserve"> </w:t>
+      </w:r>
+      <w:r>
+        <w:rPr>
+          <w:rStyle w:val="VerbatimChar"/>
+        </w:rPr>
+        <w:t xml:space="preserve">activo = true</w:t>
+      </w:r>
+      <w:r>
+        <w:t xml:space="preserve">, y el tipo está activo.</w:t>
       </w:r>
     </w:p>
     <w:p>
@@ -3171,6 +3315,500 @@
         </w:numPr>
       </w:pPr>
       <w:r>
+        <w:t xml:space="preserve">La duración de la fila define cuánto se bloquea en la agenda.</w:t>
+      </w:r>
+    </w:p>
+    <w:p>
+      <w:pPr>
+        <w:pStyle w:val="Compact"/>
+        <w:numPr>
+          <w:ilvl w:val="0"/>
+          <w:numId w:val="1003"/>
+        </w:numPr>
+      </w:pPr>
+      <w:r>
+        <w:rPr>
+          <w:rStyle w:val="VerbatimChar"/>
+        </w:rPr>
+        <w:t xml:space="preserve">GET /api/public/servicios</w:t>
+      </w:r>
+      <w:r>
+        <w:t xml:space="preserve"> </w:t>
+      </w:r>
+      <w:r>
+        <w:t xml:space="preserve">devuelve cada servicio con sus precios y</w:t>
+      </w:r>
+      <w:r>
+        <w:t xml:space="preserve"> </w:t>
+      </w:r>
+      <w:r>
+        <w:rPr>
+          <w:rStyle w:val="VerbatimChar"/>
+        </w:rPr>
+        <w:t xml:space="preserve">precio_desde</w:t>
+      </w:r>
+      <w:r>
+        <w:t xml:space="preserve">; omite los que no tienen ningún precio.</w:t>
+      </w:r>
+    </w:p>
+    <w:p>
+      <w:pPr>
+        <w:pStyle w:val="Compact"/>
+        <w:numPr>
+          <w:ilvl w:val="0"/>
+          <w:numId w:val="1003"/>
+        </w:numPr>
+      </w:pPr>
+      <w:r>
+        <w:rPr>
+          <w:rStyle w:val="VerbatimChar"/>
+        </w:rPr>
+        <w:t xml:space="preserve">POST</w:t>
+      </w:r>
+      <w:r>
+        <w:t xml:space="preserve"> </w:t>
+      </w:r>
+      <w:r>
+        <w:t xml:space="preserve">y</w:t>
+      </w:r>
+      <w:r>
+        <w:t xml:space="preserve"> </w:t>
+      </w:r>
+      <w:r>
+        <w:rPr>
+          <w:rStyle w:val="VerbatimChar"/>
+        </w:rPr>
+        <w:t xml:space="preserve">PUT /api/servicios</w:t>
+      </w:r>
+      <w:r>
+        <w:t xml:space="preserve"> </w:t>
+      </w:r>
+      <w:r>
+        <w:t xml:space="preserve">reciben</w:t>
+      </w:r>
+      <w:r>
+        <w:t xml:space="preserve"> </w:t>
+      </w:r>
+      <w:r>
+        <w:rPr>
+          <w:rStyle w:val="VerbatimChar"/>
+        </w:rPr>
+        <w:t xml:space="preserve">precios: [{ id_tipo_vehiculo, precio, duracion_min }]</w:t>
+      </w:r>
+      <w:r>
+        <w:t xml:space="preserve">. Un tipo que deja de venir queda desactivado, no borrado. No se acepta un servicio sin ningún precio.</w:t>
+      </w:r>
+    </w:p>
+    <w:p>
+      <w:pPr>
+        <w:pStyle w:val="Compact"/>
+        <w:numPr>
+          <w:ilvl w:val="0"/>
+          <w:numId w:val="1003"/>
+        </w:numPr>
+      </w:pPr>
+      <w:r>
+        <w:t xml:space="preserve">Tipos de vehículo:</w:t>
+      </w:r>
+      <w:r>
+        <w:t xml:space="preserve"> </w:t>
+      </w:r>
+      <w:r>
+        <w:rPr>
+          <w:rStyle w:val="VerbatimChar"/>
+        </w:rPr>
+        <w:t xml:space="preserve">GET/POST/PUT /api/tipos-vehiculo</w:t>
+      </w:r>
+      <w:r>
+        <w:t xml:space="preserve"> </w:t>
+      </w:r>
+      <w:r>
+        <w:t xml:space="preserve">(interno) y</w:t>
+      </w:r>
+      <w:r>
+        <w:t xml:space="preserve"> </w:t>
+      </w:r>
+      <w:r>
+        <w:rPr>
+          <w:rStyle w:val="VerbatimChar"/>
+        </w:rPr>
+        <w:t xml:space="preserve">GET /api/public/tipos-vehiculo</w:t>
+      </w:r>
+      <w:r>
+        <w:t xml:space="preserve">. El</w:t>
+      </w:r>
+      <w:r>
+        <w:t xml:space="preserve"> </w:t>
+      </w:r>
+      <w:r>
+        <w:rPr>
+          <w:rStyle w:val="VerbatimChar"/>
+        </w:rPr>
+        <w:t xml:space="preserve">codigo</w:t>
+      </w:r>
+      <w:r>
+        <w:t xml:space="preserve"> </w:t>
+      </w:r>
+      <w:r>
+        <w:t xml:space="preserve">se genera a partir del nombre.</w:t>
+      </w:r>
+    </w:p>
+    <w:p>
+      <w:pPr>
+        <w:pStyle w:val="FirstParagraph"/>
+      </w:pPr>
+      <w:r>
+        <w:rPr>
+          <w:rStyle w:val="VerbatimChar"/>
+        </w:rPr>
+        <w:t xml:space="preserve">Vehiculo.id_tipo_vehiculo</w:t>
+      </w:r>
+      <w:r>
+        <w:t xml:space="preserve"> </w:t>
+      </w:r>
+      <w:r>
+        <w:t xml:space="preserve">es obligatorio al registrar (</w:t>
+      </w:r>
+      <w:r>
+        <w:rPr>
+          <w:rStyle w:val="VerbatimChar"/>
+        </w:rPr>
+        <w:t xml:space="preserve">POST /api/vehiculos</w:t>
+      </w:r>
+      <w:r>
+        <w:t xml:space="preserve">).</w:t>
+      </w:r>
+      <w:r>
+        <w:t xml:space="preserve"> </w:t>
+      </w:r>
+      <w:r>
+        <w:t xml:space="preserve">Admite</w:t>
+      </w:r>
+      <w:r>
+        <w:t xml:space="preserve"> </w:t>
+      </w:r>
+      <w:r>
+        <w:rPr>
+          <w:rStyle w:val="VerbatimChar"/>
+        </w:rPr>
+        <w:t xml:space="preserve">null</w:t>
+      </w:r>
+      <w:r>
+        <w:t xml:space="preserve"> </w:t>
+      </w:r>
+      <w:r>
+        <w:t xml:space="preserve">solo por los vehículos anteriores al catálogo:</w:t>
+      </w:r>
+      <w:r>
+        <w:t xml:space="preserve"> </w:t>
+      </w:r>
+      <w:r>
+        <w:rPr>
+          <w:b/>
+          <w:bCs/>
+        </w:rPr>
+        <w:t xml:space="preserve">3 vehículos</w:t>
+      </w:r>
+      <w:r>
+        <w:t xml:space="preserve"> </w:t>
+      </w:r>
+      <w:r>
+        <w:t xml:space="preserve">siguen</w:t>
+      </w:r>
+      <w:r>
+        <w:t xml:space="preserve"> </w:t>
+      </w:r>
+      <w:r>
+        <w:t xml:space="preserve">sin tipo y no pueden reservar hasta que su dueño o el operador lo complete. El</w:t>
+      </w:r>
+      <w:r>
+        <w:t xml:space="preserve"> </w:t>
+      </w:r>
+      <w:r>
+        <w:t xml:space="preserve">cliente puede editar sus propios vehículos (</w:t>
+      </w:r>
+      <w:r>
+        <w:rPr>
+          <w:rStyle w:val="VerbatimChar"/>
+        </w:rPr>
+        <w:t xml:space="preserve">PUT /api/vehiculos/:id</w:t>
+      </w:r>
+      <w:r>
+        <w:t xml:space="preserve">), pero no su estado.</w:t>
+      </w:r>
+    </w:p>
+    <w:p>
+      <w:pPr>
+        <w:pStyle w:val="BlockText"/>
+      </w:pPr>
+      <w:r>
+        <w:rPr>
+          <w:b/>
+          <w:bCs/>
+        </w:rPr>
+        <w:t xml:space="preserve">Pendiente (2026-09-27):</w:t>
+      </w:r>
+      <w:r>
+        <w:t xml:space="preserve"> </w:t>
+      </w:r>
+      <w:r>
+        <w:t xml:space="preserve">el tipo</w:t>
+      </w:r>
+      <w:r>
+        <w:t xml:space="preserve"> </w:t>
+      </w:r>
+      <w:r>
+        <w:rPr>
+          <w:b/>
+          <w:bCs/>
+        </w:rPr>
+        <w:t xml:space="preserve">moto</w:t>
+      </w:r>
+      <w:r>
+        <w:t xml:space="preserve"> </w:t>
+      </w:r>
+      <w:r>
+        <w:t xml:space="preserve">no tiene ningún precio, así que</w:t>
+      </w:r>
+      <w:r>
+        <w:t xml:space="preserve"> </w:t>
+      </w:r>
+      <w:r>
+        <w:t xml:space="preserve">ningún servicio se le ofrece. La migración no inventó tarifas: se cargan desde</w:t>
+      </w:r>
+      <w:r>
+        <w:t xml:space="preserve"> </w:t>
+      </w:r>
+      <w:r>
+        <w:rPr>
+          <w:b/>
+          <w:bCs/>
+        </w:rPr>
+        <w:t xml:space="preserve">Servicios → Servicios y precios</w:t>
+      </w:r>
+      <w:r>
+        <w:t xml:space="preserve">.</w:t>
+      </w:r>
+    </w:p>
+    <w:bookmarkEnd w:id="26"/>
+    <w:bookmarkStart w:id="27" w:name="servicios-adicionales"/>
+    <w:p>
+      <w:pPr>
+        <w:pStyle w:val="Heading2"/>
+      </w:pPr>
+      <w:r>
+        <w:rPr>
+          <w:rStyle w:val="SectionNumber"/>
+        </w:rPr>
+        <w:t xml:space="preserve">0.4</w:t>
+      </w:r>
+      <w:r>
+        <w:tab/>
+      </w:r>
+      <w:r>
+        <w:t xml:space="preserve">4. Servicios adicionales</w:t>
+      </w:r>
+    </w:p>
+    <w:p>
+      <w:pPr>
+        <w:pStyle w:val="FirstParagraph"/>
+      </w:pPr>
+      <w:r>
+        <w:rPr>
+          <w:rStyle w:val="VerbatimChar"/>
+        </w:rPr>
+        <w:t xml:space="preserve">ServicioAdicional</w:t>
+      </w:r>
+      <w:r>
+        <w:t xml:space="preserve"> </w:t>
+      </w:r>
+      <w:r>
+        <w:t xml:space="preserve">(nombre, precio,</w:t>
+      </w:r>
+      <w:r>
+        <w:t xml:space="preserve"> </w:t>
+      </w:r>
+      <w:r>
+        <w:rPr>
+          <w:rStyle w:val="VerbatimChar"/>
+        </w:rPr>
+        <w:t xml:space="preserve">duracion_min</w:t>
+      </w:r>
+      <w:r>
+        <w:t xml:space="preserve"> </w:t>
+      </w:r>
+      <w:r>
+        <w:t xml:space="preserve">extra). CRUD interno en</w:t>
+      </w:r>
+      <w:r>
+        <w:t xml:space="preserve"> </w:t>
+      </w:r>
+      <w:r>
+        <w:rPr>
+          <w:rStyle w:val="VerbatimChar"/>
+        </w:rPr>
+        <w:t xml:space="preserve">/api/adicionales</w:t>
+      </w:r>
+      <w:r>
+        <w:t xml:space="preserve">; lectura pública en</w:t>
+      </w:r>
+      <w:r>
+        <w:t xml:space="preserve"> </w:t>
+      </w:r>
+      <w:r>
+        <w:rPr>
+          <w:rStyle w:val="VerbatimChar"/>
+        </w:rPr>
+        <w:t xml:space="preserve">/api/public/adicionales</w:t>
+      </w:r>
+      <w:r>
+        <w:t xml:space="preserve">.</w:t>
+      </w:r>
+    </w:p>
+    <w:p>
+      <w:pPr>
+        <w:pStyle w:val="BodyText"/>
+      </w:pPr>
+      <w:r>
+        <w:t xml:space="preserve">Al reservar, cada adicional elegido se copia a</w:t>
+      </w:r>
+      <w:r>
+        <w:t xml:space="preserve"> </w:t>
+      </w:r>
+      <w:r>
+        <w:rPr>
+          <w:rStyle w:val="VerbatimChar"/>
+        </w:rPr>
+        <w:t xml:space="preserve">ReservaAdicional</w:t>
+      </w:r>
+      <w:r>
+        <w:t xml:space="preserve"> </w:t>
+      </w:r>
+      <w:r>
+        <w:t xml:space="preserve">(nombre, precio</w:t>
+      </w:r>
+      <w:r>
+        <w:t xml:space="preserve"> </w:t>
+      </w:r>
+      <w:r>
+        <w:t xml:space="preserve">y minutos): cambiar el catálogo después no altera reservas ya hechas.</w:t>
+      </w:r>
+      <w:r>
+        <w:t xml:space="preserve"> </w:t>
+      </w:r>
+      <w:r>
+        <w:rPr>
+          <w:rStyle w:val="VerbatimChar"/>
+        </w:rPr>
+        <w:t xml:space="preserve">Reserva.precio_final</w:t>
+      </w:r>
+      <w:r>
+        <w:t xml:space="preserve"> </w:t>
+      </w:r>
+      <w:r>
+        <w:t xml:space="preserve">= precio del servicio para el tipo de vehículo (0 si lo cubre</w:t>
+      </w:r>
+      <w:r>
+        <w:t xml:space="preserve"> </w:t>
+      </w:r>
+      <w:r>
+        <w:t xml:space="preserve">un plan) + adicionales.</w:t>
+      </w:r>
+      <w:r>
+        <w:t xml:space="preserve"> </w:t>
+      </w:r>
+      <w:r>
+        <w:rPr>
+          <w:b/>
+          <w:bCs/>
+        </w:rPr>
+        <w:t xml:space="preserve">Los planes no cubren adicionales.</w:t>
+      </w:r>
+    </w:p>
+    <w:bookmarkEnd w:id="27"/>
+    <w:bookmarkStart w:id="28" w:name="cotización-y-creación-de-reservas"/>
+    <w:p>
+      <w:pPr>
+        <w:pStyle w:val="Heading2"/>
+      </w:pPr>
+      <w:r>
+        <w:rPr>
+          <w:rStyle w:val="SectionNumber"/>
+        </w:rPr>
+        <w:t xml:space="preserve">0.5</w:t>
+      </w:r>
+      <w:r>
+        <w:tab/>
+      </w:r>
+      <w:r>
+        <w:t xml:space="preserve">5. Cotización y creación de reservas</w:t>
+      </w:r>
+    </w:p>
+    <w:p>
+      <w:pPr>
+        <w:pStyle w:val="FirstParagraph"/>
+      </w:pPr>
+      <w:r>
+        <w:t xml:space="preserve">El precio y la duración los calcula siempre el backend (</w:t>
+      </w:r>
+      <w:r>
+        <w:rPr>
+          <w:rStyle w:val="VerbatimChar"/>
+        </w:rPr>
+        <w:t xml:space="preserve">services/cotizacion.service.js</w:t>
+      </w:r>
+      <w:r>
+        <w:t xml:space="preserve">);</w:t>
+      </w:r>
+      <w:r>
+        <w:t xml:space="preserve"> </w:t>
+      </w:r>
+      <w:r>
+        <w:t xml:space="preserve">lo que muestra la pantalla sale de la misma cuenta.</w:t>
+      </w:r>
+    </w:p>
+    <w:p>
+      <w:pPr>
+        <w:pStyle w:val="Compact"/>
+        <w:numPr>
+          <w:ilvl w:val="0"/>
+          <w:numId w:val="1004"/>
+        </w:numPr>
+      </w:pPr>
+      <w:r>
+        <w:rPr>
+          <w:rStyle w:val="VerbatimChar"/>
+        </w:rPr>
+        <w:t xml:space="preserve">POST /api/reservas/cotizar</w:t>
+      </w:r>
+      <w:r>
+        <w:t xml:space="preserve"> </w:t>
+      </w:r>
+      <w:r>
+        <w:t xml:space="preserve">— vista previa:</w:t>
+      </w:r>
+      <w:r>
+        <w:t xml:space="preserve"> </w:t>
+      </w:r>
+      <w:r>
+        <w:rPr>
+          <w:rStyle w:val="VerbatimChar"/>
+        </w:rPr>
+        <w:t xml:space="preserve">{ id_vehiculo, id_tipo_servicio, adicionales }</w:t>
+      </w:r>
+      <w:r>
+        <w:t xml:space="preserve">.</w:t>
+      </w:r>
+    </w:p>
+    <w:p>
+      <w:pPr>
+        <w:pStyle w:val="Compact"/>
+        <w:numPr>
+          <w:ilvl w:val="0"/>
+          <w:numId w:val="1004"/>
+        </w:numPr>
+      </w:pPr>
+      <w:r>
         <w:rPr>
           <w:rStyle w:val="VerbatimChar"/>
         </w:rPr>
@@ -3271,8 +3909,8 @@
         <w:t xml:space="preserve">.</w:t>
       </w:r>
     </w:p>
-    <w:bookmarkEnd w:id="27"/>
-    <w:bookmarkStart w:id="28" w:name="agenda-y-capacidad"/>
+    <w:bookmarkEnd w:id="28"/>
+    <w:bookmarkStart w:id="29" w:name="agenda-y-capacidad"/>
     <w:p>
       <w:pPr>
         <w:pStyle w:val="Heading2"/>
@@ -3426,7 +4064,7 @@
       <w:pPr>
         <w:numPr>
           <w:ilvl w:val="0"/>
-          <w:numId w:val="1004"/>
+          <w:numId w:val="1005"/>
         </w:numPr>
       </w:pPr>
       <w:r>
@@ -3510,7 +4148,7 @@
       <w:pPr>
         <w:numPr>
           <w:ilvl w:val="0"/>
-          <w:numId w:val="1004"/>
+          <w:numId w:val="1005"/>
         </w:numPr>
       </w:pPr>
       <w:r>
@@ -3537,7 +4175,7 @@
       <w:pPr>
         <w:numPr>
           <w:ilvl w:val="0"/>
-          <w:numId w:val="1004"/>
+          <w:numId w:val="1005"/>
         </w:numPr>
       </w:pPr>
       <w:r>
@@ -3579,7 +4217,7 @@
       <w:pPr>
         <w:numPr>
           <w:ilvl w:val="0"/>
-          <w:numId w:val="1004"/>
+          <w:numId w:val="1005"/>
         </w:numPr>
       </w:pPr>
       <w:r>
@@ -3612,7 +4250,7 @@
       <w:pPr>
         <w:numPr>
           <w:ilvl w:val="0"/>
-          <w:numId w:val="1004"/>
+          <w:numId w:val="1005"/>
         </w:numPr>
       </w:pPr>
       <w:r>
@@ -3654,7 +4292,7 @@
       <w:pPr>
         <w:numPr>
           <w:ilvl w:val="0"/>
-          <w:numId w:val="1004"/>
+          <w:numId w:val="1005"/>
         </w:numPr>
       </w:pPr>
       <w:r>
@@ -3780,7 +4418,7 @@
       <w:pPr>
         <w:numPr>
           <w:ilvl w:val="0"/>
-          <w:numId w:val="1004"/>
+          <w:numId w:val="1005"/>
         </w:numPr>
       </w:pPr>
       <w:r>
@@ -3843,7 +4481,7 @@
       <w:pPr>
         <w:numPr>
           <w:ilvl w:val="0"/>
-          <w:numId w:val="1004"/>
+          <w:numId w:val="1005"/>
         </w:numPr>
       </w:pPr>
       <w:r>
@@ -3947,8 +4585,8 @@
         <w:t xml:space="preserve">para marcarlo.</w:t>
       </w:r>
     </w:p>
-    <w:bookmarkEnd w:id="28"/>
-    <w:bookmarkStart w:id="29" w:name="fechas-y-zona-horaria"/>
+    <w:bookmarkEnd w:id="29"/>
+    <w:bookmarkStart w:id="30" w:name="fechas-y-zona-horaria"/>
     <w:p>
       <w:pPr>
         <w:pStyle w:val="Heading2"/>
@@ -4172,8 +4810,8 @@
         <w:t xml:space="preserve">.</w:t>
       </w:r>
     </w:p>
-    <w:bookmarkEnd w:id="29"/>
-    <w:bookmarkStart w:id="30" w:name="validación-de-pagos"/>
+    <w:bookmarkEnd w:id="30"/>
+    <w:bookmarkStart w:id="31" w:name="validación-de-pagos"/>
     <w:p>
       <w:pPr>
         <w:pStyle w:val="Heading2"/>
@@ -4295,8 +4933,8 @@
         <w:t xml:space="preserve">conectarla, resolver SEC-02: el webhook no valida firma.</w:t>
       </w:r>
     </w:p>
-    <w:bookmarkEnd w:id="30"/>
-    <w:bookmarkStart w:id="34" w:name="dashboard-y-reportes"/>
+    <w:bookmarkEnd w:id="31"/>
+    <w:bookmarkStart w:id="35" w:name="dashboard-y-reportes"/>
     <w:p>
       <w:pPr>
         <w:pStyle w:val="Heading2"/>
@@ -4619,7 +5257,7 @@
         </w:tc>
       </w:tr>
     </w:tbl>
-    <w:bookmarkStart w:id="31" w:name="dashboard"/>
+    <w:bookmarkStart w:id="32" w:name="dashboard"/>
     <w:p>
       <w:pPr>
         <w:pStyle w:val="Heading3"/>
@@ -4711,8 +5349,8 @@
         <w:t xml:space="preserve">: un aviso que no se puede atender es ruido.</w:t>
       </w:r>
     </w:p>
-    <w:bookmarkEnd w:id="31"/>
-    <w:bookmarkStart w:id="32" w:name="reportes"/>
+    <w:bookmarkEnd w:id="32"/>
+    <w:bookmarkStart w:id="33" w:name="reportes"/>
     <w:p>
       <w:pPr>
         <w:pStyle w:val="Heading3"/>
@@ -5124,8 +5762,8 @@
         <w:t xml:space="preserve">información en texto.</w:t>
       </w:r>
     </w:p>
-    <w:bookmarkEnd w:id="32"/>
-    <w:bookmarkStart w:id="33" w:name="endpoints"/>
+    <w:bookmarkEnd w:id="33"/>
+    <w:bookmarkStart w:id="34" w:name="endpoints"/>
     <w:p>
       <w:pPr>
         <w:pStyle w:val="Heading3"/>
@@ -5696,9 +6334,9 @@
         <w:t xml:space="preserve">.</w:t>
       </w:r>
     </w:p>
-    <w:bookmarkEnd w:id="33"/>
     <w:bookmarkEnd w:id="34"/>
-    <w:bookmarkStart w:id="36" w:name="parámetros-del-sistema"/>
+    <w:bookmarkEnd w:id="35"/>
+    <w:bookmarkStart w:id="37" w:name="parámetros-del-sistema"/>
     <w:p>
       <w:pPr>
         <w:pStyle w:val="Heading2"/>
@@ -6250,7 +6888,7 @@
         <w:t xml:space="preserve">reservas del día siguiente.</w:t>
       </w:r>
     </w:p>
-    <w:bookmarkStart w:id="35" w:name="X2d991c11642d71b575ad7284abc639ef720f461"/>
+    <w:bookmarkStart w:id="36" w:name="X2d991c11642d71b575ad7284abc639ef720f461"/>
     <w:p>
       <w:pPr>
         <w:pStyle w:val="Heading3"/>
@@ -6508,7 +7146,7 @@
       <w:pPr>
         <w:numPr>
           <w:ilvl w:val="0"/>
-          <w:numId w:val="1005"/>
+          <w:numId w:val="1006"/>
         </w:numPr>
       </w:pPr>
       <w:r>
@@ -6526,7 +7164,7 @@
       <w:pPr>
         <w:numPr>
           <w:ilvl w:val="0"/>
-          <w:numId w:val="1005"/>
+          <w:numId w:val="1006"/>
         </w:numPr>
       </w:pPr>
       <w:r>
@@ -6572,7 +7210,7 @@
       <w:pPr>
         <w:numPr>
           <w:ilvl w:val="0"/>
-          <w:numId w:val="1005"/>
+          <w:numId w:val="1006"/>
         </w:numPr>
       </w:pPr>
       <w:r>
@@ -6625,7 +7263,7 @@
       <w:pPr>
         <w:numPr>
           <w:ilvl w:val="0"/>
-          <w:numId w:val="1005"/>
+          <w:numId w:val="1006"/>
         </w:numPr>
       </w:pPr>
       <w:r>
@@ -6681,7 +7319,7 @@
       <w:pPr>
         <w:numPr>
           <w:ilvl w:val="0"/>
-          <w:numId w:val="1005"/>
+          <w:numId w:val="1006"/>
         </w:numPr>
       </w:pPr>
       <w:r>
@@ -6694,9 +7332,9 @@
         <w:t xml:space="preserve">esquema anterior entra una vez más y listo. No hay que avisar a nadie.</w:t>
       </w:r>
     </w:p>
-    <w:bookmarkEnd w:id="35"/>
     <w:bookmarkEnd w:id="36"/>
-    <w:bookmarkStart w:id="39" w:name="despliegue-y-migraciones"/>
+    <w:bookmarkEnd w:id="37"/>
+    <w:bookmarkStart w:id="40" w:name="despliegue-y-migraciones"/>
     <w:p>
       <w:pPr>
         <w:pStyle w:val="Heading2"/>
@@ -6894,7 +7532,7 @@
         </w:tc>
       </w:tr>
     </w:tbl>
-    <w:bookmarkStart w:id="37" w:name="X3542f0bc8c68579460bfcc52fd9f91ffbf8b96e"/>
+    <w:bookmarkStart w:id="38" w:name="X3542f0bc8c68579460bfcc52fd9f91ffbf8b96e"/>
     <w:p>
       <w:pPr>
         <w:pStyle w:val="Heading3"/>
@@ -7165,8 +7803,8 @@
         <w:t xml:space="preserve">.</w:t>
       </w:r>
     </w:p>
-    <w:bookmarkEnd w:id="37"/>
-    <w:bookmarkStart w:id="38" w:name="X441b3d28acb90abc337d26351cfd579c17c637f"/>
+    <w:bookmarkEnd w:id="38"/>
+    <w:bookmarkStart w:id="39" w:name="X441b3d28acb90abc337d26351cfd579c17c637f"/>
     <w:p>
       <w:pPr>
         <w:pStyle w:val="Heading3"/>
@@ -7418,9 +8056,9 @@
         <w:t xml:space="preserve">y su remoto usa la clave personal.</w:t>
       </w:r>
     </w:p>
-    <w:bookmarkEnd w:id="38"/>
     <w:bookmarkEnd w:id="39"/>
-    <w:bookmarkStart w:id="40" w:name="app-android"/>
+    <w:bookmarkEnd w:id="40"/>
+    <w:bookmarkStart w:id="41" w:name="app-android"/>
     <w:p>
       <w:pPr>
         <w:pStyle w:val="Heading2"/>
@@ -7555,8 +8193,8 @@
         <w:t xml:space="preserve">y reinstalarla.</w:t>
       </w:r>
     </w:p>
-    <w:bookmarkEnd w:id="40"/>
-    <w:bookmarkStart w:id="43" w:name="respaldos-y-recuperación"/>
+    <w:bookmarkEnd w:id="41"/>
+    <w:bookmarkStart w:id="44" w:name="respaldos-y-recuperación"/>
     <w:p>
       <w:pPr>
         <w:pStyle w:val="Heading2"/>
@@ -7877,7 +8515,7 @@
         <w:t xml:space="preserve">de dos días, avisa: es la señal de que el cron dejó de correr.</w:t>
       </w:r>
     </w:p>
-    <w:bookmarkStart w:id="41" w:name="lo-que-el-respaldo-todavía-no-cubre"/>
+    <w:bookmarkStart w:id="42" w:name="lo-que-el-respaldo-todavía-no-cubre"/>
     <w:p>
       <w:pPr>
         <w:pStyle w:val="Heading3"/>
@@ -7979,8 +8617,8 @@
         <w:t xml:space="preserve">apuntando a otro equipo, un NAS o un disco externo.</w:t>
       </w:r>
     </w:p>
-    <w:bookmarkEnd w:id="41"/>
-    <w:bookmarkStart w:id="42" w:name="qué-contiene-cada-paquete"/>
+    <w:bookmarkEnd w:id="42"/>
+    <w:bookmarkStart w:id="43" w:name="qué-contiene-cada-paquete"/>
     <w:p>
       <w:pPr>
         <w:pStyle w:val="Heading3"/>
@@ -8191,9 +8829,9 @@
         <w:t xml:space="preserve">.</w:t>
       </w:r>
     </w:p>
-    <w:bookmarkEnd w:id="42"/>
     <w:bookmarkEnd w:id="43"/>
-    <w:bookmarkStart w:id="44" w:name="mantenimiento"/>
+    <w:bookmarkEnd w:id="44"/>
+    <w:bookmarkStart w:id="45" w:name="mantenimiento"/>
     <w:p>
       <w:pPr>
         <w:pStyle w:val="Heading2"/>
@@ -8216,7 +8854,7 @@
         <w:pStyle w:val="Compact"/>
         <w:numPr>
           <w:ilvl w:val="0"/>
-          <w:numId w:val="1006"/>
+          <w:numId w:val="1007"/>
         </w:numPr>
       </w:pPr>
       <w:r>
@@ -8244,7 +8882,7 @@
         <w:pStyle w:val="Compact"/>
         <w:numPr>
           <w:ilvl w:val="0"/>
-          <w:numId w:val="1006"/>
+          <w:numId w:val="1007"/>
         </w:numPr>
       </w:pPr>
       <w:r>
@@ -8314,7 +8952,7 @@
         <w:pStyle w:val="Compact"/>
         <w:numPr>
           <w:ilvl w:val="0"/>
-          <w:numId w:val="1006"/>
+          <w:numId w:val="1007"/>
         </w:numPr>
       </w:pPr>
       <w:r>
@@ -8394,8 +9032,8 @@
         <w:t xml:space="preserve">.</w:t>
       </w:r>
     </w:p>
-    <w:bookmarkEnd w:id="44"/>
-    <w:bookmarkStart w:id="45" w:name="monitoreo-y-logs"/>
+    <w:bookmarkEnd w:id="45"/>
+    <w:bookmarkStart w:id="46" w:name="monitoreo-y-logs"/>
     <w:p>
       <w:pPr>
         <w:pStyle w:val="Heading2"/>
@@ -8463,8 +9101,8 @@
         </w:pict>
       </w:r>
     </w:p>
-    <w:bookmarkEnd w:id="45"/>
-    <w:bookmarkStart w:id="46" w:name="control-de-versiones"/>
+    <w:bookmarkEnd w:id="46"/>
+    <w:bookmarkStart w:id="47" w:name="control-de-versiones"/>
     <w:p>
       <w:pPr>
         <w:pStyle w:val="Heading2"/>
@@ -8626,7 +9264,7 @@
         <w:t xml:space="preserve">repositorio; la fuente es el archivo Markdown correspondiente.</w:t>
       </w:r>
     </w:p>
-    <w:bookmarkEnd w:id="46"/>
+    <w:bookmarkEnd w:id="47"/>
     <w:sectPr/>
   </w:body>
 </w:document>
@@ -8809,6 +9447,91 @@
       </w:pPr>
     </w:lvl>
   </w:abstractNum>
+  <w:abstractNum w:abstractNumId="99411">
+    <w:nsid w:val="00A99411"/>
+    <w:multiLevelType w:val="multilevel"/>
+    <w:lvl w:ilvl="0">
+      <w:start w:val="1"/>
+      <w:numFmt w:val="decimal"/>
+      <w:lvlText w:val="%1."/>
+      <w:lvlJc w:val="left"/>
+      <w:pPr>
+        <w:ind w:left="720" w:hanging="480"/>
+      </w:pPr>
+    </w:lvl>
+    <w:lvl w:ilvl="1">
+      <w:start w:val="1"/>
+      <w:numFmt w:val="decimal"/>
+      <w:lvlText w:val="%2."/>
+      <w:lvlJc w:val="left"/>
+      <w:pPr>
+        <w:ind w:left="1440" w:hanging="480"/>
+      </w:pPr>
+    </w:lvl>
+    <w:lvl w:ilvl="2">
+      <w:start w:val="1"/>
+      <w:numFmt w:val="decimal"/>
+      <w:lvlText w:val="%3."/>
+      <w:lvlJc w:val="left"/>
+      <w:pPr>
+        <w:ind w:left="2160" w:hanging="480"/>
+      </w:pPr>
+    </w:lvl>
+    <w:lvl w:ilvl="3">
+      <w:start w:val="1"/>
+      <w:numFmt w:val="decimal"/>
+      <w:lvlText w:val="%4."/>
+      <w:lvlJc w:val="left"/>
+      <w:pPr>
+        <w:ind w:left="2880" w:hanging="480"/>
+      </w:pPr>
+    </w:lvl>
+    <w:lvl w:ilvl="4">
+      <w:start w:val="1"/>
+      <w:numFmt w:val="decimal"/>
+      <w:lvlText w:val="%5."/>
+      <w:lvlJc w:val="left"/>
+      <w:pPr>
+        <w:ind w:left="3600" w:hanging="480"/>
+      </w:pPr>
+    </w:lvl>
+    <w:lvl w:ilvl="5">
+      <w:start w:val="1"/>
+      <w:numFmt w:val="decimal"/>
+      <w:lvlText w:val="%6."/>
+      <w:lvlJc w:val="left"/>
+      <w:pPr>
+        <w:ind w:left="4320" w:hanging="480"/>
+      </w:pPr>
+    </w:lvl>
+    <w:lvl w:ilvl="6">
+      <w:start w:val="1"/>
+      <w:numFmt w:val="decimal"/>
+      <w:lvlText w:val="%7."/>
+      <w:lvlJc w:val="left"/>
+      <w:pPr>
+        <w:ind w:left="5040" w:hanging="480"/>
+      </w:pPr>
+    </w:lvl>
+    <w:lvl w:ilvl="7">
+      <w:start w:val="1"/>
+      <w:numFmt w:val="decimal"/>
+      <w:lvlText w:val="%8."/>
+      <w:lvlJc w:val="left"/>
+      <w:pPr>
+        <w:ind w:left="5760" w:hanging="480"/>
+      </w:pPr>
+    </w:lvl>
+    <w:lvl w:ilvl="8">
+      <w:start w:val="1"/>
+      <w:numFmt w:val="decimal"/>
+      <w:lvlText w:val="%9."/>
+      <w:lvlJc w:val="left"/>
+      <w:pPr>
+        <w:ind w:left="6480" w:hanging="480"/>
+      </w:pPr>
+    </w:lvl>
+  </w:abstractNum>
   <w:num w:numId="1000">
     <w:abstractNumId w:val="990"/>
   </w:num>
@@ -8816,7 +9539,34 @@
     <w:abstractNumId w:val="991"/>
   </w:num>
   <w:num w:numId="1002">
-    <w:abstractNumId w:val="991"/>
+    <w:abstractNumId w:val="99411"/>
+    <w:lvlOverride w:ilvl="0">
+      <w:startOverride w:val="1"/>
+    </w:lvlOverride>
+    <w:lvlOverride w:ilvl="1">
+      <w:startOverride w:val="1"/>
+    </w:lvlOverride>
+    <w:lvlOverride w:ilvl="2">
+      <w:startOverride w:val="1"/>
+    </w:lvlOverride>
+    <w:lvlOverride w:ilvl="3">
+      <w:startOverride w:val="1"/>
+    </w:lvlOverride>
+    <w:lvlOverride w:ilvl="4">
+      <w:startOverride w:val="1"/>
+    </w:lvlOverride>
+    <w:lvlOverride w:ilvl="5">
+      <w:startOverride w:val="1"/>
+    </w:lvlOverride>
+    <w:lvlOverride w:ilvl="6">
+      <w:startOverride w:val="1"/>
+    </w:lvlOverride>
+    <w:lvlOverride w:ilvl="7">
+      <w:startOverride w:val="1"/>
+    </w:lvlOverride>
+    <w:lvlOverride w:ilvl="8">
+      <w:startOverride w:val="1"/>
+    </w:lvlOverride>
   </w:num>
   <w:num w:numId="1003">
     <w:abstractNumId w:val="991"/>
@@ -8828,6 +9578,9 @@
     <w:abstractNumId w:val="991"/>
   </w:num>
   <w:num w:numId="1006">
+    <w:abstractNumId w:val="991"/>
+  </w:num>
+  <w:num w:numId="1007">
     <w:abstractNumId w:val="991"/>
   </w:num>
 </w:numbering>

</xml_diff>

<commit_message>
Pago antes del servicio (salvo empresas)
El lavado de contado se paga antes de hacerlo: con saldo no se puede iniciar
y el equipo a domicilio no puede marcar "Sali". Cuentan solo pagos
aprobados. Las empresas (credito, corte mensual) y lo incluido en un plan
quedan afuera. Parametro reservas.pago_anticipado (1) para apagarlo.
Avisos en Mis trabajos, Reservas, Mis reservas y el boleto. 3 pruebas nuevas
(285 en total).

Co-Authored-By: Claude Opus 5.5 (1M context) <noreply@anthropic.com>
</commit_message>
<xml_diff>
--- a/docs/08_MANUAL_ADMINISTRADOR/Manual_Administrador.docx
+++ b/docs/08_MANUAL_ADMINISTRADOR/Manual_Administrador.docx
@@ -453,7 +453,7 @@
         <w:t xml:space="preserve">.</w:t>
       </w:r>
     </w:p>
-    <w:bookmarkStart w:id="25" w:name="usuarios-y-roles"/>
+    <w:bookmarkStart w:id="26" w:name="usuarios-y-roles"/>
     <w:p>
       <w:pPr>
         <w:pStyle w:val="Heading2"/>
@@ -3513,8 +3513,206 @@
       </w:r>
     </w:p>
     <w:bookmarkEnd w:id="24"/>
+    <w:bookmarkStart w:id="25" w:name="Xfcec145e06d5e5bf3f75934e06962dc6ad06c78"/>
+    <w:p>
+      <w:pPr>
+        <w:pStyle w:val="Heading3"/>
+      </w:pPr>
+      <w:r>
+        <w:rPr>
+          <w:rStyle w:val="SectionNumber"/>
+        </w:rPr>
+        <w:t xml:space="preserve">0.1.6</w:t>
+      </w:r>
+      <w:r>
+        <w:tab/>
+      </w:r>
+      <w:r>
+        <w:t xml:space="preserve">1.6 Pago antes del servicio (desde el 2026-10-12)</w:t>
+      </w:r>
+    </w:p>
+    <w:p>
+      <w:pPr>
+        <w:pStyle w:val="FirstParagraph"/>
+      </w:pPr>
+      <w:r>
+        <w:t xml:space="preserve">El cliente de contado</w:t>
+      </w:r>
+      <w:r>
+        <w:t xml:space="preserve"> </w:t>
+      </w:r>
+      <w:r>
+        <w:rPr>
+          <w:b/>
+          <w:bCs/>
+        </w:rPr>
+        <w:t xml:space="preserve">paga antes del lavado</w:t>
+      </w:r>
+      <w:r>
+        <w:t xml:space="preserve">: con saldo pendiente el sistema</w:t>
+      </w:r>
+      <w:r>
+        <w:t xml:space="preserve"> </w:t>
+      </w:r>
+      <w:r>
+        <w:t xml:space="preserve">no deja</w:t>
+      </w:r>
+      <w:r>
+        <w:t xml:space="preserve"> </w:t>
+      </w:r>
+      <w:r>
+        <w:rPr>
+          <w:b/>
+          <w:bCs/>
+        </w:rPr>
+        <w:t xml:space="preserve">iniciar</w:t>
+      </w:r>
+      <w:r>
+        <w:t xml:space="preserve"> </w:t>
+      </w:r>
+      <w:r>
+        <w:t xml:space="preserve">el lavado, ni marcar</w:t>
+      </w:r>
+      <w:r>
+        <w:t xml:space="preserve"> </w:t>
+      </w:r>
+      <w:r>
+        <w:rPr>
+          <w:b/>
+          <w:bCs/>
+        </w:rPr>
+        <w:t xml:space="preserve">“</w:t>
+      </w:r>
+      <w:r>
+        <w:rPr>
+          <w:b/>
+          <w:bCs/>
+        </w:rPr>
+        <w:t xml:space="preserve">Salí</w:t>
+      </w:r>
+      <w:r>
+        <w:rPr>
+          <w:b/>
+          <w:bCs/>
+        </w:rPr>
+        <w:t xml:space="preserve">”</w:t>
+      </w:r>
+      <w:r>
+        <w:t xml:space="preserve"> </w:t>
+      </w:r>
+      <w:r>
+        <w:t xml:space="preserve">a un equipo a domicilio.</w:t>
+      </w:r>
+      <w:r>
+        <w:t xml:space="preserve"> </w:t>
+      </w:r>
+      <w:r>
+        <w:t xml:space="preserve">Cuenta solo el pago</w:t>
+      </w:r>
+      <w:r>
+        <w:t xml:space="preserve"> </w:t>
+      </w:r>
+      <w:r>
+        <w:rPr>
+          <w:b/>
+          <w:bCs/>
+        </w:rPr>
+        <w:t xml:space="preserve">aprobado</w:t>
+      </w:r>
+      <w:r>
+        <w:t xml:space="preserve"> </w:t>
+      </w:r>
+      <w:r>
+        <w:t xml:space="preserve">(un comprobante en verificación hay que</w:t>
+      </w:r>
+      <w:r>
+        <w:t xml:space="preserve"> </w:t>
+      </w:r>
+      <w:r>
+        <w:t xml:space="preserve">aprobarlo antes en</w:t>
+      </w:r>
+      <w:r>
+        <w:t xml:space="preserve"> </w:t>
+      </w:r>
+      <w:r>
+        <w:t xml:space="preserve">“</w:t>
+      </w:r>
+      <w:r>
+        <w:t xml:space="preserve">Pagos por verificar</w:t>
+      </w:r>
+      <w:r>
+        <w:t xml:space="preserve">”</w:t>
+      </w:r>
+      <w:r>
+        <w:t xml:space="preserve">). Confirmar la reserva no exige pago.</w:t>
+      </w:r>
+      <w:r>
+        <w:t xml:space="preserve"> </w:t>
+      </w:r>
+      <w:r>
+        <w:t xml:space="preserve">Las</w:t>
+      </w:r>
+      <w:r>
+        <w:t xml:space="preserve"> </w:t>
+      </w:r>
+      <w:r>
+        <w:rPr>
+          <w:b/>
+          <w:bCs/>
+        </w:rPr>
+        <w:t xml:space="preserve">empresas</w:t>
+      </w:r>
+      <w:r>
+        <w:t xml:space="preserve"> </w:t>
+      </w:r>
+      <w:r>
+        <w:t xml:space="preserve">quedan afuera: se lavan a crédito y se cobran en el corte. Lo</w:t>
+      </w:r>
+      <w:r>
+        <w:t xml:space="preserve"> </w:t>
+      </w:r>
+      <w:r>
+        <w:t xml:space="preserve">incluido en un plan ($0) no se ve afectado. Se apaga con el parámetro</w:t>
+      </w:r>
+      <w:r>
+        <w:t xml:space="preserve"> </w:t>
+      </w:r>
+      <w:r>
+        <w:rPr>
+          <w:rStyle w:val="VerbatimChar"/>
+        </w:rPr>
+        <w:t xml:space="preserve">reservas.pago_anticipado</w:t>
+      </w:r>
+      <w:r>
+        <w:t xml:space="preserve"> </w:t>
+      </w:r>
+      <w:r>
+        <w:t xml:space="preserve">= 0 (Planes → Reglas de reserva).</w:t>
+      </w:r>
+    </w:p>
+    <w:p>
+      <w:pPr>
+        <w:pStyle w:val="BlockText"/>
+      </w:pPr>
+      <w:r>
+        <w:t xml:space="preserve">Visita a domicilio fallida con un cargo menor al 100 %: como el lavado ya</w:t>
+      </w:r>
+      <w:r>
+        <w:t xml:space="preserve"> </w:t>
+      </w:r>
+      <w:r>
+        <w:t xml:space="preserve">estaba pagado, la diferencia queda a favor del cliente (el sistema no hace</w:t>
+      </w:r>
+      <w:r>
+        <w:t xml:space="preserve"> </w:t>
+      </w:r>
+      <w:r>
+        <w:t xml:space="preserve">devoluciones; se resuelve a mano).</w:t>
+      </w:r>
+    </w:p>
     <w:bookmarkEnd w:id="25"/>
-    <w:bookmarkStart w:id="27" w:name="catálogos"/>
+    <w:bookmarkEnd w:id="26"/>
+    <w:bookmarkStart w:id="28" w:name="catálogos"/>
     <w:p>
       <w:pPr>
         <w:pStyle w:val="Heading2"/>
@@ -3939,7 +4137,7 @@
         <w:t xml:space="preserve">.</w:t>
       </w:r>
     </w:p>
-    <w:bookmarkStart w:id="26" w:name="vehículos-de-cada-cliente"/>
+    <w:bookmarkStart w:id="27" w:name="vehículos-de-cada-cliente"/>
     <w:p>
       <w:pPr>
         <w:pStyle w:val="Heading3"/>
@@ -4302,9 +4500,9 @@
         <w:t xml:space="preserve">abrir la fila no consulta nada: es instantáneo.</w:t>
       </w:r>
     </w:p>
-    <w:bookmarkEnd w:id="26"/>
     <w:bookmarkEnd w:id="27"/>
-    <w:bookmarkStart w:id="28" w:name="precios-por-tipo-de-vehículo"/>
+    <w:bookmarkEnd w:id="28"/>
+    <w:bookmarkStart w:id="29" w:name="precios-por-tipo-de-vehículo"/>
     <w:p>
       <w:pPr>
         <w:pStyle w:val="Heading2"/>
@@ -4711,8 +4909,8 @@
         <w:t xml:space="preserve">.</w:t>
       </w:r>
     </w:p>
-    <w:bookmarkEnd w:id="28"/>
-    <w:bookmarkStart w:id="29" w:name="servicios-adicionales"/>
+    <w:bookmarkEnd w:id="29"/>
+    <w:bookmarkStart w:id="30" w:name="servicios-adicionales"/>
     <w:p>
       <w:pPr>
         <w:pStyle w:val="Heading2"/>
@@ -4846,8 +5044,8 @@
         <w:t xml:space="preserve">Los planes no cubren adicionales.</w:t>
       </w:r>
     </w:p>
-    <w:bookmarkEnd w:id="29"/>
-    <w:bookmarkStart w:id="30" w:name="cotización-y-creación-de-reservas"/>
+    <w:bookmarkEnd w:id="30"/>
+    <w:bookmarkStart w:id="31" w:name="cotización-y-creación-de-reservas"/>
     <w:p>
       <w:pPr>
         <w:pStyle w:val="Heading2"/>
@@ -5030,8 +5228,8 @@
         <w:t xml:space="preserve">.</w:t>
       </w:r>
     </w:p>
-    <w:bookmarkEnd w:id="30"/>
-    <w:bookmarkStart w:id="31" w:name="agenda-y-capacidad"/>
+    <w:bookmarkEnd w:id="31"/>
+    <w:bookmarkStart w:id="32" w:name="agenda-y-capacidad"/>
     <w:p>
       <w:pPr>
         <w:pStyle w:val="Heading2"/>
@@ -5706,8 +5904,8 @@
         <w:t xml:space="preserve">para marcarlo.</w:t>
       </w:r>
     </w:p>
-    <w:bookmarkEnd w:id="31"/>
-    <w:bookmarkStart w:id="32" w:name="fechas-y-zona-horaria"/>
+    <w:bookmarkEnd w:id="32"/>
+    <w:bookmarkStart w:id="33" w:name="fechas-y-zona-horaria"/>
     <w:p>
       <w:pPr>
         <w:pStyle w:val="Heading2"/>
@@ -5931,8 +6129,8 @@
         <w:t xml:space="preserve">.</w:t>
       </w:r>
     </w:p>
-    <w:bookmarkEnd w:id="32"/>
-    <w:bookmarkStart w:id="33" w:name="validación-de-pagos"/>
+    <w:bookmarkEnd w:id="33"/>
+    <w:bookmarkStart w:id="34" w:name="validación-de-pagos"/>
     <w:p>
       <w:pPr>
         <w:pStyle w:val="Heading2"/>
@@ -6054,8 +6252,8 @@
         <w:t xml:space="preserve">conectarla, resolver SEC-02: el webhook no valida firma.</w:t>
       </w:r>
     </w:p>
-    <w:bookmarkEnd w:id="33"/>
-    <w:bookmarkStart w:id="37" w:name="dashboard-y-reportes"/>
+    <w:bookmarkEnd w:id="34"/>
+    <w:bookmarkStart w:id="38" w:name="dashboard-y-reportes"/>
     <w:p>
       <w:pPr>
         <w:pStyle w:val="Heading2"/>
@@ -6378,7 +6576,7 @@
         </w:tc>
       </w:tr>
     </w:tbl>
-    <w:bookmarkStart w:id="34" w:name="dashboard"/>
+    <w:bookmarkStart w:id="35" w:name="dashboard"/>
     <w:p>
       <w:pPr>
         <w:pStyle w:val="Heading3"/>
@@ -6470,8 +6668,8 @@
         <w:t xml:space="preserve">: un aviso que no se puede atender es ruido.</w:t>
       </w:r>
     </w:p>
-    <w:bookmarkEnd w:id="34"/>
-    <w:bookmarkStart w:id="35" w:name="reportes"/>
+    <w:bookmarkEnd w:id="35"/>
+    <w:bookmarkStart w:id="36" w:name="reportes"/>
     <w:p>
       <w:pPr>
         <w:pStyle w:val="Heading3"/>
@@ -6883,8 +7081,8 @@
         <w:t xml:space="preserve">información en texto.</w:t>
       </w:r>
     </w:p>
-    <w:bookmarkEnd w:id="35"/>
-    <w:bookmarkStart w:id="36" w:name="endpoints"/>
+    <w:bookmarkEnd w:id="36"/>
+    <w:bookmarkStart w:id="37" w:name="endpoints"/>
     <w:p>
       <w:pPr>
         <w:pStyle w:val="Heading3"/>
@@ -7455,9 +7653,9 @@
         <w:t xml:space="preserve">.</w:t>
       </w:r>
     </w:p>
-    <w:bookmarkEnd w:id="36"/>
     <w:bookmarkEnd w:id="37"/>
-    <w:bookmarkStart w:id="39" w:name="parámetros-del-sistema"/>
+    <w:bookmarkEnd w:id="38"/>
+    <w:bookmarkStart w:id="40" w:name="parámetros-del-sistema"/>
     <w:p>
       <w:pPr>
         <w:pStyle w:val="Heading2"/>
@@ -8009,7 +8207,7 @@
         <w:t xml:space="preserve">reservas del día siguiente.</w:t>
       </w:r>
     </w:p>
-    <w:bookmarkStart w:id="38" w:name="X2d991c11642d71b575ad7284abc639ef720f461"/>
+    <w:bookmarkStart w:id="39" w:name="X2d991c11642d71b575ad7284abc639ef720f461"/>
     <w:p>
       <w:pPr>
         <w:pStyle w:val="Heading3"/>
@@ -8453,9 +8651,9 @@
         <w:t xml:space="preserve">esquema anterior entra una vez más y listo. No hay que avisar a nadie.</w:t>
       </w:r>
     </w:p>
-    <w:bookmarkEnd w:id="38"/>
     <w:bookmarkEnd w:id="39"/>
-    <w:bookmarkStart w:id="42" w:name="despliegue-y-migraciones"/>
+    <w:bookmarkEnd w:id="40"/>
+    <w:bookmarkStart w:id="43" w:name="despliegue-y-migraciones"/>
     <w:p>
       <w:pPr>
         <w:pStyle w:val="Heading2"/>
@@ -8653,7 +8851,7 @@
         </w:tc>
       </w:tr>
     </w:tbl>
-    <w:bookmarkStart w:id="40" w:name="X3542f0bc8c68579460bfcc52fd9f91ffbf8b96e"/>
+    <w:bookmarkStart w:id="41" w:name="X3542f0bc8c68579460bfcc52fd9f91ffbf8b96e"/>
     <w:p>
       <w:pPr>
         <w:pStyle w:val="Heading3"/>
@@ -8924,8 +9122,8 @@
         <w:t xml:space="preserve">.</w:t>
       </w:r>
     </w:p>
-    <w:bookmarkEnd w:id="40"/>
-    <w:bookmarkStart w:id="41" w:name="X441b3d28acb90abc337d26351cfd579c17c637f"/>
+    <w:bookmarkEnd w:id="41"/>
+    <w:bookmarkStart w:id="42" w:name="X441b3d28acb90abc337d26351cfd579c17c637f"/>
     <w:p>
       <w:pPr>
         <w:pStyle w:val="Heading3"/>
@@ -9177,9 +9375,9 @@
         <w:t xml:space="preserve">y su remoto usa la clave personal.</w:t>
       </w:r>
     </w:p>
-    <w:bookmarkEnd w:id="41"/>
     <w:bookmarkEnd w:id="42"/>
-    <w:bookmarkStart w:id="43" w:name="app-android"/>
+    <w:bookmarkEnd w:id="43"/>
+    <w:bookmarkStart w:id="44" w:name="app-android"/>
     <w:p>
       <w:pPr>
         <w:pStyle w:val="Heading2"/>
@@ -9314,8 +9512,8 @@
         <w:t xml:space="preserve">y reinstalarla.</w:t>
       </w:r>
     </w:p>
-    <w:bookmarkEnd w:id="43"/>
-    <w:bookmarkStart w:id="46" w:name="respaldos-y-recuperación"/>
+    <w:bookmarkEnd w:id="44"/>
+    <w:bookmarkStart w:id="47" w:name="respaldos-y-recuperación"/>
     <w:p>
       <w:pPr>
         <w:pStyle w:val="Heading2"/>
@@ -9636,7 +9834,7 @@
         <w:t xml:space="preserve">de dos días, avisa: es la señal de que el cron dejó de correr.</w:t>
       </w:r>
     </w:p>
-    <w:bookmarkStart w:id="44" w:name="lo-que-el-respaldo-todavía-no-cubre"/>
+    <w:bookmarkStart w:id="45" w:name="lo-que-el-respaldo-todavía-no-cubre"/>
     <w:p>
       <w:pPr>
         <w:pStyle w:val="Heading3"/>
@@ -9738,8 +9936,8 @@
         <w:t xml:space="preserve">apuntando a otro equipo, un NAS o un disco externo.</w:t>
       </w:r>
     </w:p>
-    <w:bookmarkEnd w:id="44"/>
-    <w:bookmarkStart w:id="45" w:name="qué-contiene-cada-paquete"/>
+    <w:bookmarkEnd w:id="45"/>
+    <w:bookmarkStart w:id="46" w:name="qué-contiene-cada-paquete"/>
     <w:p>
       <w:pPr>
         <w:pStyle w:val="Heading3"/>
@@ -9950,9 +10148,9 @@
         <w:t xml:space="preserve">.</w:t>
       </w:r>
     </w:p>
-    <w:bookmarkEnd w:id="45"/>
     <w:bookmarkEnd w:id="46"/>
-    <w:bookmarkStart w:id="47" w:name="mantenimiento"/>
+    <w:bookmarkEnd w:id="47"/>
+    <w:bookmarkStart w:id="48" w:name="mantenimiento"/>
     <w:p>
       <w:pPr>
         <w:pStyle w:val="Heading2"/>
@@ -10153,8 +10351,8 @@
         <w:t xml:space="preserve">.</w:t>
       </w:r>
     </w:p>
-    <w:bookmarkEnd w:id="47"/>
-    <w:bookmarkStart w:id="48" w:name="monitoreo-y-logs"/>
+    <w:bookmarkEnd w:id="48"/>
+    <w:bookmarkStart w:id="49" w:name="monitoreo-y-logs"/>
     <w:p>
       <w:pPr>
         <w:pStyle w:val="Heading2"/>
@@ -10222,8 +10420,8 @@
         </w:pict>
       </w:r>
     </w:p>
-    <w:bookmarkEnd w:id="48"/>
-    <w:bookmarkStart w:id="49" w:name="control-de-versiones"/>
+    <w:bookmarkEnd w:id="49"/>
+    <w:bookmarkStart w:id="50" w:name="control-de-versiones"/>
     <w:p>
       <w:pPr>
         <w:pStyle w:val="Heading2"/>
@@ -10385,7 +10583,7 @@
         <w:t xml:space="preserve">repositorio; la fuente es el archivo Markdown correspondiente.</w:t>
       </w:r>
     </w:p>
-    <w:bookmarkEnd w:id="49"/>
+    <w:bookmarkEnd w:id="50"/>
     <w:sectPr/>
   </w:body>
 </w:document>

</xml_diff>